<commit_message>
chore(cmr): CMR shablon yangilandi
Co-Authored-By: Claude Sonnet 5.5 <noreply@anthropic.com>
</commit_message>
<xml_diff>
--- a/backend/templates/CMR template.docx
+++ b/backend/templates/CMR template.docx
@@ -2379,7 +2379,7 @@
                 <w:sz w:val="14"/>
                 <w:szCs w:val="14"/>
               </w:rPr>
-              <w:t xml:space="preserve">$Место_разгрузки$</w:t>
+              <w:t>$Место_разгрузки$</w:t>
             </w:r>
           </w:p>
         </w:tc>
@@ -3651,202 +3651,6 @@
             </w:pPr>
             <w:r>
               <w:rPr>
-                <w:b/>
-                <w:noProof/>
-              </w:rPr>
-              <mc:AlternateContent>
-                <mc:Choice Requires="wps">
-                  <w:drawing>
-                    <wp:anchor distT="0" distB="0" distL="114300" distR="114300" simplePos="0" relativeHeight="251659776" behindDoc="1" locked="0" layoutInCell="0" allowOverlap="1" wp14:anchorId="3AFE97A1" wp14:editId="19070D5F">
-                      <wp:simplePos x="0" y="0"/>
-                      <wp:positionH relativeFrom="column">
-                        <wp:posOffset>295910</wp:posOffset>
-                      </wp:positionH>
-                      <wp:positionV relativeFrom="paragraph">
-                        <wp:posOffset>56515</wp:posOffset>
-                      </wp:positionV>
-                      <wp:extent cx="6076315" cy="1338580"/>
-                      <wp:effectExtent l="0" t="0" r="0" b="0"/>
-                      <wp:wrapNone/>
-                      <wp:docPr id="2" name="Text Box 29"/>
-                      <wp:cNvGraphicFramePr>
-                        <a:graphicFrameLocks xmlns:a="http://schemas.openxmlformats.org/drawingml/2006/main"/>
-                      </wp:cNvGraphicFramePr>
-                      <a:graphic xmlns:a="http://schemas.openxmlformats.org/drawingml/2006/main">
-                        <a:graphicData uri="http://schemas.microsoft.com/office/word/2010/wordprocessingShape">
-                          <wps:wsp>
-                            <wps:cNvSpPr txBox="1">
-                              <a:spLocks noChangeArrowheads="1"/>
-                            </wps:cNvSpPr>
-                            <wps:spPr bwMode="auto">
-                              <a:xfrm>
-                                <a:off x="0" y="0"/>
-                                <a:ext cx="6076315" cy="1338580"/>
-                              </a:xfrm>
-                              <a:prstGeom prst="rect">
-                                <a:avLst/>
-                              </a:prstGeom>
-                              <a:noFill/>
-                              <a:ln>
-                                <a:noFill/>
-                              </a:ln>
-                              <a:extLst>
-                                <a:ext uri="{909E8E84-426E-40DD-AFC4-6F175D3DCCD1}">
-                                  <a14:hiddenFill xmlns:a14="http://schemas.microsoft.com/office/drawing/2010/main">
-                                    <a:solidFill>
-                                      <a:srgbClr val="FFFFFF"/>
-                                    </a:solidFill>
-                                  </a14:hiddenFill>
-                                </a:ext>
-                                <a:ext uri="{91240B29-F687-4F45-9708-019B960494DF}">
-                                  <a14:hiddenLine xmlns:a14="http://schemas.microsoft.com/office/drawing/2010/main" w="9525">
-                                    <a:solidFill>
-                                      <a:srgbClr val="000000"/>
-                                    </a:solidFill>
-                                    <a:miter lim="800000"/>
-                                    <a:headEnd/>
-                                    <a:tailEnd/>
-                                  </a14:hiddenLine>
-                                </a:ext>
-                              </a:extLst>
-                            </wps:spPr>
-                            <wps:txbx>
-                              <w:txbxContent>
-                                <w:p>
-                                  <w:pPr>
-                                    <w:jc w:val="center"/>
-                                    <w:rPr>
-                                      <w:rFonts w:ascii="Arial" w:hAnsi="Arial" w:cs="Arial"/>
-                                      <w:b/>
-                                      <w:bCs/>
-                                      <w:sz w:val="40"/>
-                                      <w:szCs w:val="40"/>
-                                      <w:lang w:val="en-US"/>
-                                    </w:rPr>
-                                  </w:pPr>
-                                </w:p>
-                                <w:p>
-                                  <w:pPr>
-                                    <w:jc w:val="center"/>
-                                    <w:rPr>
-                                      <w:rFonts w:ascii="Arial" w:hAnsi="Arial" w:cs="Arial"/>
-                                      <w:b/>
-                                      <w:bCs/>
-                                      <w:color w:val="F2F2F2"/>
-                                      <w:sz w:val="144"/>
-                                      <w:szCs w:val="144"/>
-                                      <w:lang w:val="en-US"/>
-                                    </w:rPr>
-                                  </w:pPr>
-                                  <w:r>
-                                    <w:rPr>
-                                      <w:rFonts w:ascii="Arial" w:hAnsi="Arial" w:cs="Arial"/>
-                                      <w:b/>
-                                      <w:bCs/>
-                                      <w:color w:val="F2F2F2"/>
-                                      <w:sz w:val="144"/>
-                                      <w:szCs w:val="144"/>
-                                      <w:lang w:val="en-US"/>
-                                    </w:rPr>
-                                    <w:t>CMR</w:t>
-                                  </w:r>
-                                </w:p>
-                                <w:p>
-                                  <w:pPr>
-                                    <w:jc w:val="center"/>
-                                    <w:rPr>
-                                      <w:rFonts w:ascii="Arial" w:hAnsi="Arial" w:cs="Arial"/>
-                                      <w:b/>
-                                      <w:bCs/>
-                                      <w:sz w:val="40"/>
-                                      <w:szCs w:val="40"/>
-                                      <w:lang w:val="en-US"/>
-                                    </w:rPr>
-                                  </w:pPr>
-                                </w:p>
-                              </w:txbxContent>
-                            </wps:txbx>
-                            <wps:bodyPr rot="0" vert="horz" wrap="square" lIns="91440" tIns="45720" rIns="91440" bIns="45720" anchor="t" anchorCtr="0" upright="1">
-                              <a:noAutofit/>
-                            </wps:bodyPr>
-                          </wps:wsp>
-                        </a:graphicData>
-                      </a:graphic>
-                      <wp14:sizeRelH relativeFrom="page">
-                        <wp14:pctWidth>0</wp14:pctWidth>
-                      </wp14:sizeRelH>
-                      <wp14:sizeRelV relativeFrom="page">
-                        <wp14:pctHeight>0</wp14:pctHeight>
-                      </wp14:sizeRelV>
-                    </wp:anchor>
-                  </w:drawing>
-                </mc:Choice>
-                <mc:Fallback>
-                  <w:pict>
-                    <v:shape w14:anchorId="3AFE97A1" id="Text Box 29" o:spid="_x0000_s1028" type="#_x0000_t202" style="position:absolute;left:0;text-align:left;margin-left:23.3pt;margin-top:4.45pt;width:478.45pt;height:105.4pt;z-index:-251656704;visibility:visible;mso-wrap-style:square;mso-width-percent:0;mso-height-percent:0;mso-wrap-distance-left:9pt;mso-wrap-distance-top:0;mso-wrap-distance-right:9pt;mso-wrap-distance-bottom:0;mso-position-horizontal:absolute;mso-position-horizontal-relative:text;mso-position-vertical:absolute;mso-position-vertical-relative:text;mso-width-percent:0;mso-height-percent:0;mso-width-relative:page;mso-height-relative:page;v-text-anchor:top" o:gfxdata="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" o:allowincell="f" filled="f" stroked="f">
-                      <v:textbox>
-                        <w:txbxContent>
-                          <w:p>
-                            <w:pPr>
-                              <w:jc w:val="center"/>
-                              <w:rPr>
-                                <w:rFonts w:ascii="Arial" w:hAnsi="Arial" w:cs="Arial"/>
-                                <w:b/>
-                                <w:bCs/>
-                                <w:sz w:val="40"/>
-                                <w:szCs w:val="40"/>
-                                <w:lang w:val="en-US"/>
-                              </w:rPr>
-                            </w:pPr>
-                          </w:p>
-                          <w:p>
-                            <w:pPr>
-                              <w:jc w:val="center"/>
-                              <w:rPr>
-                                <w:rFonts w:ascii="Arial" w:hAnsi="Arial" w:cs="Arial"/>
-                                <w:b/>
-                                <w:bCs/>
-                                <w:color w:val="F2F2F2"/>
-                                <w:sz w:val="144"/>
-                                <w:szCs w:val="144"/>
-                                <w:lang w:val="en-US"/>
-                              </w:rPr>
-                            </w:pPr>
-                            <w:r>
-                              <w:rPr>
-                                <w:rFonts w:ascii="Arial" w:hAnsi="Arial" w:cs="Arial"/>
-                                <w:b/>
-                                <w:bCs/>
-                                <w:color w:val="F2F2F2"/>
-                                <w:sz w:val="144"/>
-                                <w:szCs w:val="144"/>
-                                <w:lang w:val="en-US"/>
-                              </w:rPr>
-                              <w:t>CMR</w:t>
-                            </w:r>
-                          </w:p>
-                          <w:p>
-                            <w:pPr>
-                              <w:jc w:val="center"/>
-                              <w:rPr>
-                                <w:rFonts w:ascii="Arial" w:hAnsi="Arial" w:cs="Arial"/>
-                                <w:b/>
-                                <w:bCs/>
-                                <w:sz w:val="40"/>
-                                <w:szCs w:val="40"/>
-                                <w:lang w:val="en-US"/>
-                              </w:rPr>
-                            </w:pPr>
-                          </w:p>
-                        </w:txbxContent>
-                      </v:textbox>
-                    </v:shape>
-                  </w:pict>
-                </mc:Fallback>
-              </mc:AlternateContent>
-            </w:r>
-            <w:r>
-              <w:rPr>
                 <w:rFonts w:ascii="Arial" w:hAnsi="Arial" w:cs="Arial"/>
                 <w:b/>
                 <w:sz w:val="16"/>
@@ -4013,84 +3817,6 @@
             </w:pPr>
             <w:r>
               <w:rPr>
-                <w:noProof/>
-                <w:color w:val="F2F2F2"/>
-              </w:rPr>
-              <mc:AlternateContent>
-                <mc:Choice Requires="wps">
-                  <w:drawing>
-                    <wp:anchor distT="0" distB="0" distL="114300" distR="114300" simplePos="0" relativeHeight="251658752" behindDoc="1" locked="0" layoutInCell="0" allowOverlap="1" wp14:anchorId="540BD567" wp14:editId="277555F8">
-                      <wp:simplePos x="0" y="0"/>
-                      <wp:positionH relativeFrom="column">
-                        <wp:posOffset>1954530</wp:posOffset>
-                      </wp:positionH>
-                      <wp:positionV relativeFrom="paragraph">
-                        <wp:posOffset>60325</wp:posOffset>
-                      </wp:positionV>
-                      <wp:extent cx="2682240" cy="1155700"/>
-                      <wp:effectExtent l="0" t="0" r="0" b="0"/>
-                      <wp:wrapNone/>
-                      <wp:docPr id="1" name="Oval 6"/>
-                      <wp:cNvGraphicFramePr>
-                        <a:graphicFrameLocks xmlns:a="http://schemas.openxmlformats.org/drawingml/2006/main"/>
-                      </wp:cNvGraphicFramePr>
-                      <a:graphic xmlns:a="http://schemas.openxmlformats.org/drawingml/2006/main">
-                        <a:graphicData uri="http://schemas.microsoft.com/office/word/2010/wordprocessingShape">
-                          <wps:wsp>
-                            <wps:cNvSpPr>
-                              <a:spLocks noChangeArrowheads="1"/>
-                            </wps:cNvSpPr>
-                            <wps:spPr bwMode="auto">
-                              <a:xfrm>
-                                <a:off x="0" y="0"/>
-                                <a:ext cx="2682240" cy="1155700"/>
-                              </a:xfrm>
-                              <a:prstGeom prst="ellipse">
-                                <a:avLst/>
-                              </a:prstGeom>
-                              <a:noFill/>
-                              <a:ln w="127000">
-                                <a:solidFill>
-                                  <a:srgbClr val="F2F2F2"/>
-                                </a:solidFill>
-                                <a:round/>
-                                <a:headEnd/>
-                                <a:tailEnd/>
-                              </a:ln>
-                              <a:extLst>
-                                <a:ext uri="{909E8E84-426E-40DD-AFC4-6F175D3DCCD1}">
-                                  <a14:hiddenFill xmlns:a14="http://schemas.microsoft.com/office/drawing/2010/main">
-                                    <a:solidFill>
-                                      <a:srgbClr val="FFFFFF"/>
-                                    </a:solidFill>
-                                  </a14:hiddenFill>
-                                </a:ext>
-                              </a:extLst>
-                            </wps:spPr>
-                            <wps:bodyPr rot="0" vert="horz" wrap="square" lIns="91440" tIns="45720" rIns="91440" bIns="45720" anchor="t" anchorCtr="0" upright="1">
-                              <a:noAutofit/>
-                            </wps:bodyPr>
-                          </wps:wsp>
-                        </a:graphicData>
-                      </a:graphic>
-                      <wp14:sizeRelH relativeFrom="page">
-                        <wp14:pctWidth>0</wp14:pctWidth>
-                      </wp14:sizeRelH>
-                      <wp14:sizeRelV relativeFrom="page">
-                        <wp14:pctHeight>0</wp14:pctHeight>
-                      </wp14:sizeRelV>
-                    </wp:anchor>
-                  </w:drawing>
-                </mc:Choice>
-                <mc:Fallback>
-                  <w:pict>
-                    <v:oval w14:anchorId="2EBAE875" id="Oval 6" o:spid="_x0000_s1026" style="position:absolute;margin-left:153.9pt;margin-top:4.75pt;width:211.2pt;height:91pt;z-index:-251657728;visibility:visible;mso-wrap-style:square;mso-width-percent:0;mso-height-percent:0;mso-wrap-distance-left:9pt;mso-wrap-distance-top:0;mso-wrap-distance-right:9pt;mso-wrap-distance-bottom:0;mso-position-horizontal:absolute;mso-position-horizontal-relative:text;mso-position-vertical:absolute;mso-position-vertical-relative:text;mso-width-percent:0;mso-height-percent:0;mso-width-relative:page;mso-height-relative:page;v-text-anchor:top" o:gfxdata="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" o:allowincell="f" filled="f" strokecolor="#f2f2f2" strokeweight="10pt"/>
-                  </w:pict>
-                </mc:Fallback>
-              </mc:AlternateContent>
-            </w:r>
-            <w:r>
-              <w:rPr>
                 <w:rFonts w:ascii="Arial" w:hAnsi="Arial" w:cs="Arial"/>
                 <w:b/>
                 <w:bCs/>
@@ -4885,9 +4611,8 @@
                 <w:szCs w:val="16"/>
                 <w:lang w:val="de-DE"/>
               </w:rPr>
-              <w:t>$$MTR</w:t>
-            </w:r>
-            <w:proofErr w:type="gramStart"/>
+              <w:t>$$MTR$</w:t>
+            </w:r>
             <w:r>
               <w:rPr>
                 <w:rFonts w:ascii="Arial" w:hAnsi="Arial" w:cs="Arial"/>
@@ -4897,7 +4622,7 @@
                 <w:szCs w:val="16"/>
                 <w:lang w:val="de-DE"/>
               </w:rPr>
-              <w:t>$</w:t>
+              <w:t xml:space="preserve"> </w:t>
             </w:r>
             <w:r>
               <w:rPr>
@@ -4908,20 +4633,8 @@
                 <w:szCs w:val="16"/>
                 <w:lang w:val="de-DE"/>
               </w:rPr>
-              <w:t xml:space="preserve"> </w:t>
-            </w:r>
-            <w:r>
-              <w:rPr>
-                <w:rFonts w:ascii="Arial" w:hAnsi="Arial" w:cs="Arial"/>
-                <w:b/>
-                <w:bCs/>
-                <w:sz w:val="16"/>
-                <w:szCs w:val="16"/>
-                <w:lang w:val="de-DE"/>
-              </w:rPr>
               <w:t xml:space="preserve">  </w:t>
             </w:r>
-            <w:proofErr w:type="gramEnd"/>
             <w:r>
               <w:rPr>
                 <w:rFonts w:ascii="Arial" w:hAnsi="Arial" w:cs="Arial"/>

</xml_diff>

<commit_message>
chore(cmr): CMR shablonlari yangilandi
Co-Authored-By: Claude Sonnet 5.5 <noreply@anthropic.com>
</commit_message>
<xml_diff>
--- a/backend/templates/CMR template.docx
+++ b/backend/templates/CMR template.docx
@@ -2376,8 +2376,8 @@
               <w:rPr>
                 <w:rFonts w:ascii="Arial" w:hAnsi="Arial" w:cs="Arial"/>
                 <w:b/>
-                <w:sz w:val="14"/>
-                <w:szCs w:val="14"/>
+                <w:sz w:val="16"/>
+                <w:szCs w:val="16"/>
               </w:rPr>
               <w:t>$Место_разгрузки$</w:t>
             </w:r>

</xml_diff>